<commit_message>
docs: sinkronisasi dokumen GTK 2026, PGRI Guru Prima, dan takarir video captions.srt
</commit_message>
<xml_diff>
--- a/lab/doc/20260930 - PGRI Guru Prima 2026/Lampiran 1 - Surat Pernyataan Keaslian Karya.docx
+++ b/lab/doc/20260930 - PGRI Guru Prima 2026/Lampiran 1 - Surat Pernyataan Keaslian Karya.docx
@@ -35,6 +35,20 @@
       </w:pPr>
       <w:r>
         <w:t>Yang bertanda tangan di bawah ini:</w:t>
+        <w:br/>
+        <w:t>Nama                                     : Ach. Chanifuddin Fanani, S.Pd.</w:t>
+        <w:br/>
+        <w:t>NIP / NUPTK                              : 19910826 202012 1 007 / 9158 7696 7013 0183</w:t>
+        <w:br/>
+        <w:t>Nomor Pokok Anggota (NPA) PGRI           : ........................................................</w:t>
+        <w:br/>
+        <w:t>Jabatan                                  : Guru Informatika</w:t>
+        <w:br/>
+        <w:t>Unit Kerja                               : SMP Negeri 2 Lamongan</w:t>
+        <w:br/>
+        <w:t>Alamat                                   : Jl. Veteran No. 3, Lamongan, Jawa Timur 62212</w:t>
+        <w:br/>
+        <w:t>Nomor Telepon / WhatsApp                 : +62 815-8885-508</w:t>
       </w:r>
     </w:p>
     <w:tbl>
@@ -430,23 +444,14 @@
         <w:t>Dengan ini menyatakan bahwa karya inovasi berjudul:</w:t>
         <w:br/>
         <w:br/>
-      </w:r>
-      <w:r>
-        <w:rPr>
-          <w:b/>
-        </w:rPr>
-        <w:t>“MPI SISTEM KOMPUTER: MENYELAM KE DALAM MESIN DIGITAL”</w:t>
+        <w:t>“MENYELAM KE DALAM MESIN DIGITAL: INOVASI MEDIA PEMBELAJARAN INTERAKTIF SISTEM KOMPUTER BERBASIS WEB DI SMP NEGERI 2 LAMONGAN”</w:t>
         <w:br/>
-        <w:t>(Media Pembelajaran Interaktif Berbasis Web dengan Koding dan Kecerdasan Artifisial)</w:t>
+        <w:t>(Media Pembelajaran Interaktif Berbasis Web dengan Koding Mandiri dan Kecerdasan Artifisial — Akses: https://fanani.my.id/lab/mpi/sistem-komputer/)</w:t>
         <w:br/>
         <w:br/>
-      </w:r>
-      <w:r>
         <w:t>merupakan karya asli yang dibuat dan dikembangkan secara mandiri oleh saya sendiri. Karya tersebut bukan hasil plagiasi, fabrikasi, maupun modifikasi tanpa izin, dan seluruh informasi yang disampaikan dalam laporan inovasi dapat dipertanggungjawabkan kebenarannya.</w:t>
         <w:br/>
         <w:br/>
-      </w:r>
-      <w:r>
         <w:t>Apabila di kemudian hari terbukti ditemukan indikasi plagiasi atau pelanggaran etika akademik atas karya ini, maka saya bersedia menerima sanksi yang ditetapkan oleh panitia, termasuk diskualifikasi atau pencabutan gelar kejuaraan sesuai dengan ketentuan yang berlaku.</w:t>
       </w:r>
     </w:p>
@@ -465,33 +470,22 @@
         <w:jc w:val="right"/>
       </w:pPr>
       <w:r>
-        <w:t>Lamongan,      Oktober 2026</w:t>
+        <w:t>Lamongan, 30 September 2026</w:t>
         <w:br/>
         <w:t>Yang membuat pernyataan,</w:t>
         <w:br/>
         <w:br/>
         <w:br/>
         <w:br/>
-      </w:r>
-      <w:r>
-        <w:rPr>
-          <w:color w:val="808080"/>
-          <w:sz w:val="18"/>
-        </w:rPr>
+        <w:br/>
         <w:t>[ Materai Rp 10.000 ]</w:t>
         <w:br/>
         <w:br/>
         <w:br/>
-      </w:r>
-      <w:r>
-        <w:rPr>
-          <w:b/>
-        </w:rPr>
+        <w:br/>
         <w:t>( Ach. Chanifuddin Fanani, S.Pd. )</w:t>
         <w:br/>
-      </w:r>
-      <w:r>
-        <w:t>NPA PGRI. ........................................</w:t>
+        <w:t>NIP. 19910826 202012 1 007</w:t>
       </w:r>
     </w:p>
     <w:sectPr>

</xml_diff>